<commit_message>
Revise report structure and forecasting rationale
</commit_message>
<xml_diff>
--- a/014 fase 4 - report/Rapport.docx
+++ b/014 fase 4 - report/Rapport.docx
@@ -1717,6 +1717,46 @@
           <w:iCs/>
         </w:rPr>
         <w:t xml:space="preserve">Hvordan påvirker valg av prognosemodell prediksjonsnøyaktigheten for offhire-hendelser for fartøy innenfor samme offshoresegment, når maskinlæringsmodeller sammenlignes med tradisjonelle tidsseriemodeller?</w:t>
+      </w:r>
+    </w:p>
+    <w:p>
+      <w:pPr>
+        <w:pStyle w:val="BodyText"/>
+      </w:pPr>
+      <w:r>
+        <w:t xml:space="preserve">For å presisere hva prognoseproblemet faktisk består i, deles problemstillingen videre inn i to delspørsmål:</w:t>
+      </w:r>
+    </w:p>
+    <w:p>
+      <w:pPr>
+        <w:pStyle w:val="Compact"/>
+        <w:numPr>
+          <w:ilvl w:val="0"/>
+          <w:numId w:val="1003"/>
+        </w:numPr>
+      </w:pPr>
+      <w:r>
+        <w:t xml:space="preserve">Når kommer neste nedetid?</w:t>
+      </w:r>
+    </w:p>
+    <w:p>
+      <w:pPr>
+        <w:pStyle w:val="Compact"/>
+        <w:numPr>
+          <w:ilvl w:val="0"/>
+          <w:numId w:val="1003"/>
+        </w:numPr>
+      </w:pPr>
+      <w:r>
+        <w:t xml:space="preserve">Hvor stor blir den?</w:t>
+      </w:r>
+    </w:p>
+    <w:p>
+      <w:pPr>
+        <w:pStyle w:val="FirstParagraph"/>
+      </w:pPr>
+      <w:r>
+        <w:t xml:space="preserve">Disse delspørsmålene peker mot at timing og størrelse i prinsippet kan forstås som to ulike prediksjonsproblemer. I denne oppgaven analyseres de likevel innenfor ett felles månedlig prognoseoppsett, der modellene predikerer offhire-prosent for neste fartøy-måned. I praksis betyr det at størrelsen modelleres direkte, mens tidspunktet for neste nedetid tolkes indirekte gjennom om prognosen holder seg ved null eller går over null.</w:t>
       </w:r>
     </w:p>
     <w:bookmarkEnd w:id="23"/>
@@ -2933,6 +2973,71 @@
         <w:pStyle w:val="BodyText"/>
       </w:pPr>
       <w:r>
+        <w:t xml:space="preserve">Ligning</w:t>
+      </w:r>
+      <w:r>
+        <w:t xml:space="preserve"> </w:t>
+      </w:r>
+      <w:r>
+        <w:rPr>
+          <w:rStyle w:val="VerbatimChar"/>
+        </w:rPr>
+        <w:t xml:space="preserve">(3.1)</w:t>
+      </w:r>
+      <w:r>
+        <w:t xml:space="preserve"> </w:t>
+      </w:r>
+      <w:r>
+        <w:t xml:space="preserve">viser at</w:t>
+      </w:r>
+      <w:r>
+        <w:t xml:space="preserve"> </w:t>
+      </w:r>
+      <w:r>
+        <w:rPr>
+          <w:rStyle w:val="VerbatimChar"/>
+        </w:rPr>
+        <w:t xml:space="preserve">SARIMA</w:t>
+      </w:r>
+      <w:r>
+        <w:t xml:space="preserve"> </w:t>
+      </w:r>
+      <w:r>
+        <w:t xml:space="preserve">kan kombinere kortsiktig dynamikk og et mulig årlig sesongsignal i samme modell. At sesongleddet skrives med</w:t>
+      </w:r>
+      <w:r>
+        <w:t xml:space="preserve"> </w:t>
+      </w:r>
+      <w:r>
+        <w:rPr>
+          <w:rStyle w:val="VerbatimChar"/>
+        </w:rPr>
+        <w:t xml:space="preserve">B^{12}</w:t>
+      </w:r>
+      <w:r>
+        <w:t xml:space="preserve"> </w:t>
+      </w:r>
+      <w:r>
+        <w:t xml:space="preserve">betyr konkret at modellen kan hente informasjon fra samme måned året før, altså fra observasjonen</w:t>
+      </w:r>
+      <w:r>
+        <w:t xml:space="preserve"> </w:t>
+      </w:r>
+      <w:r>
+        <w:rPr>
+          <w:rStyle w:val="VerbatimChar"/>
+        </w:rPr>
+        <w:t xml:space="preserve">y_{t-12}</w:t>
+      </w:r>
+      <w:r>
+        <w:t xml:space="preserve">.</w:t>
+      </w:r>
+    </w:p>
+    <w:p>
+      <w:pPr>
+        <w:pStyle w:val="BodyText"/>
+      </w:pPr>
+      <w:r>
         <w:t xml:space="preserve">Teoretisk er</w:t>
       </w:r>
       <w:r>
@@ -3926,6 +4031,59 @@
       </m:oMath>
       <w:r>
         <w:t xml:space="preserve">.</w:t>
+      </w:r>
+    </w:p>
+    <w:p>
+      <w:pPr>
+        <w:pStyle w:val="BodyText"/>
+      </w:pPr>
+      <w:r>
+        <w:t xml:space="preserve">Ligningene</w:t>
+      </w:r>
+      <w:r>
+        <w:t xml:space="preserve"> </w:t>
+      </w:r>
+      <w:r>
+        <w:rPr>
+          <w:rStyle w:val="VerbatimChar"/>
+        </w:rPr>
+        <w:t xml:space="preserve">(3.2)</w:t>
+      </w:r>
+      <w:r>
+        <w:t xml:space="preserve"> </w:t>
+      </w:r>
+      <w:r>
+        <w:t xml:space="preserve">til</w:t>
+      </w:r>
+      <w:r>
+        <w:t xml:space="preserve"> </w:t>
+      </w:r>
+      <w:r>
+        <w:rPr>
+          <w:rStyle w:val="VerbatimChar"/>
+        </w:rPr>
+        <w:t xml:space="preserve">(3.5)</w:t>
+      </w:r>
+      <w:r>
+        <w:t xml:space="preserve"> </w:t>
+      </w:r>
+      <w:r>
+        <w:t xml:space="preserve">viser hvordan nivå, trend, sesong og én-stegsprognose oppdateres rekursivt. Også her representerer</w:t>
+      </w:r>
+      <w:r>
+        <w:t xml:space="preserve"> </w:t>
+      </w:r>
+      <w:r>
+        <w:rPr>
+          <w:rStyle w:val="VerbatimChar"/>
+        </w:rPr>
+        <w:t xml:space="preserve">t-12</w:t>
+      </w:r>
+      <w:r>
+        <w:t xml:space="preserve"> </w:t>
+      </w:r>
+      <w:r>
+        <w:t xml:space="preserve">samme måned året før, slik at modellen kan teste om et årlig mønster faktisk tilfører informasjon utover det løpende nivået.</w:t>
       </w:r>
     </w:p>
     <w:p>
@@ -4981,6 +5139,71 @@
         <w:pStyle w:val="BodyText"/>
       </w:pPr>
       <w:r>
+        <w:t xml:space="preserve">Ligningene</w:t>
+      </w:r>
+      <w:r>
+        <w:t xml:space="preserve"> </w:t>
+      </w:r>
+      <w:r>
+        <w:rPr>
+          <w:rStyle w:val="VerbatimChar"/>
+        </w:rPr>
+        <w:t xml:space="preserve">(3.6)</w:t>
+      </w:r>
+      <w:r>
+        <w:t xml:space="preserve"> </w:t>
+      </w:r>
+      <w:r>
+        <w:t xml:space="preserve">til</w:t>
+      </w:r>
+      <w:r>
+        <w:t xml:space="preserve"> </w:t>
+      </w:r>
+      <w:r>
+        <w:rPr>
+          <w:rStyle w:val="VerbatimChar"/>
+        </w:rPr>
+        <w:t xml:space="preserve">(3.8)</w:t>
+      </w:r>
+      <w:r>
+        <w:t xml:space="preserve"> </w:t>
+      </w:r>
+      <w:r>
+        <w:t xml:space="preserve">tydeliggjør at</w:t>
+      </w:r>
+      <w:r>
+        <w:t xml:space="preserve"> </w:t>
+      </w:r>
+      <w:r>
+        <w:rPr>
+          <w:rStyle w:val="VerbatimChar"/>
+        </w:rPr>
+        <w:t xml:space="preserve">XGBoost</w:t>
+      </w:r>
+      <w:r>
+        <w:t xml:space="preserve"> </w:t>
+      </w:r>
+      <w:r>
+        <w:t xml:space="preserve">ikke modellerer tidsserien gjennom én eksplisitt serieformel, men gjennom en additiv prediksjonsfunksjon med regularisering. Tidsavhengigheten må derfor legges inn via features som blant annet kan peke ett år tilbake gjennom</w:t>
+      </w:r>
+      <w:r>
+        <w:t xml:space="preserve"> </w:t>
+      </w:r>
+      <w:r>
+        <w:rPr>
+          <w:rStyle w:val="VerbatimChar"/>
+        </w:rPr>
+        <w:t xml:space="preserve">lag_12</w:t>
+      </w:r>
+      <w:r>
+        <w:t xml:space="preserve">.</w:t>
+      </w:r>
+    </w:p>
+    <w:p>
+      <w:pPr>
+        <w:pStyle w:val="BodyText"/>
+      </w:pPr>
+      <w:r>
         <w:t xml:space="preserve">Chen og Guestrin (2016) viser at</w:t>
       </w:r>
       <w:r>
@@ -6526,6 +6749,74 @@
         <w:pStyle w:val="BodyText"/>
       </w:pPr>
       <w:r>
+        <w:t xml:space="preserve">Ligningene</w:t>
+      </w:r>
+      <w:r>
+        <w:t xml:space="preserve"> </w:t>
+      </w:r>
+      <w:r>
+        <w:rPr>
+          <w:rStyle w:val="VerbatimChar"/>
+        </w:rPr>
+        <w:t xml:space="preserve">(3.9)</w:t>
+      </w:r>
+      <w:r>
+        <w:t xml:space="preserve"> </w:t>
+      </w:r>
+      <w:r>
+        <w:t xml:space="preserve">til</w:t>
+      </w:r>
+      <w:r>
+        <w:t xml:space="preserve"> </w:t>
+      </w:r>
+      <w:r>
+        <w:rPr>
+          <w:rStyle w:val="VerbatimChar"/>
+        </w:rPr>
+        <w:t xml:space="preserve">(3.15)</w:t>
+      </w:r>
+      <w:r>
+        <w:t xml:space="preserve"> </w:t>
+      </w:r>
+      <w:r>
+        <w:t xml:space="preserve">viser portmekanismen som gjør at</w:t>
+      </w:r>
+      <w:r>
+        <w:t xml:space="preserve"> </w:t>
+      </w:r>
+      <w:r>
+        <w:rPr>
+          <w:rStyle w:val="VerbatimChar"/>
+        </w:rPr>
+        <w:t xml:space="preserve">LSTM</w:t>
+      </w:r>
+      <w:r>
+        <w:t xml:space="preserve"> </w:t>
+      </w:r>
+      <w:r>
+        <w:t xml:space="preserve">kan bevare, oppdatere og filtrere historisk informasjon over tid. I denne oppgaven skjer dette over et observasjonsvindu på</w:t>
+      </w:r>
+      <w:r>
+        <w:t xml:space="preserve"> </w:t>
+      </w:r>
+      <w:r>
+        <w:rPr>
+          <w:rStyle w:val="VerbatimChar"/>
+        </w:rPr>
+        <w:t xml:space="preserve">12</w:t>
+      </w:r>
+      <w:r>
+        <w:t xml:space="preserve"> </w:t>
+      </w:r>
+      <w:r>
+        <w:t xml:space="preserve">måneder, slik at modellen alltid ser ett helt år bakover før den predikerer neste måned.</w:t>
+      </w:r>
+    </w:p>
+    <w:p>
+      <w:pPr>
+        <w:pStyle w:val="BodyText"/>
+      </w:pPr>
+      <w:r>
         <w:t xml:space="preserve">Portene regulerer hvilken informasjon som beholdes, oppdateres og eksponeres videre i sekvensen. Denne strukturen gjør modellen fundamentalt forskjellig fra feature-baserte maskinlæringsmodeller: tidsavhengigheten læres i selve nettverket og trenger ikke kodes fullt ut manuelt som laggede features.</w:t>
       </w:r>
     </w:p>
@@ -7121,6 +7412,136 @@
         <w:pStyle w:val="BodyText"/>
       </w:pPr>
       <w:r>
+        <w:t xml:space="preserve">På tvers av modellene ble en</w:t>
+      </w:r>
+      <w:r>
+        <w:t xml:space="preserve"> </w:t>
+      </w:r>
+      <w:r>
+        <w:rPr>
+          <w:rStyle w:val="VerbatimChar"/>
+        </w:rPr>
+        <w:t xml:space="preserve">12</w:t>
+      </w:r>
+      <w:r>
+        <w:t xml:space="preserve">-månedersmekanisme inkludert fordi datasettet består av månedlige observasjoner, og ett år derfor er den mest naturlige kandidaten for eventuell sesongvariasjon. I</w:t>
+      </w:r>
+      <w:r>
+        <w:t xml:space="preserve"> </w:t>
+      </w:r>
+      <w:r>
+        <w:rPr>
+          <w:rStyle w:val="VerbatimChar"/>
+        </w:rPr>
+        <w:t xml:space="preserve">SARIMA</w:t>
+      </w:r>
+      <w:r>
+        <w:t xml:space="preserve"> </w:t>
+      </w:r>
+      <w:r>
+        <w:t xml:space="preserve">og eksponentiell glatting betyr dette at modeller med periode</w:t>
+      </w:r>
+      <w:r>
+        <w:t xml:space="preserve"> </w:t>
+      </w:r>
+      <w:r>
+        <w:rPr>
+          <w:rStyle w:val="VerbatimChar"/>
+        </w:rPr>
+        <w:t xml:space="preserve">12</w:t>
+      </w:r>
+      <w:r>
+        <w:t xml:space="preserve"> </w:t>
+      </w:r>
+      <w:r>
+        <w:t xml:space="preserve">kan vurderes, mens det i</w:t>
+      </w:r>
+      <w:r>
+        <w:t xml:space="preserve"> </w:t>
+      </w:r>
+      <w:r>
+        <w:rPr>
+          <w:rStyle w:val="VerbatimChar"/>
+        </w:rPr>
+        <w:t xml:space="preserve">XGBoost</w:t>
+      </w:r>
+      <w:r>
+        <w:t xml:space="preserve"> </w:t>
+      </w:r>
+      <w:r>
+        <w:t xml:space="preserve">kommer inn gjennom</w:t>
+      </w:r>
+      <w:r>
+        <w:t xml:space="preserve"> </w:t>
+      </w:r>
+      <w:r>
+        <w:rPr>
+          <w:rStyle w:val="VerbatimChar"/>
+        </w:rPr>
+        <w:t xml:space="preserve">lag_12</w:t>
+      </w:r>
+      <w:r>
+        <w:t xml:space="preserve"> </w:t>
+      </w:r>
+      <w:r>
+        <w:t xml:space="preserve">og</w:t>
+      </w:r>
+      <w:r>
+        <w:t xml:space="preserve"> </w:t>
+      </w:r>
+      <w:r>
+        <w:rPr>
+          <w:rStyle w:val="VerbatimChar"/>
+        </w:rPr>
+        <w:t xml:space="preserve">rolling_mean_12</w:t>
+      </w:r>
+      <w:r>
+        <w:t xml:space="preserve">, og i</w:t>
+      </w:r>
+      <w:r>
+        <w:t xml:space="preserve"> </w:t>
+      </w:r>
+      <w:r>
+        <w:rPr>
+          <w:rStyle w:val="VerbatimChar"/>
+        </w:rPr>
+        <w:t xml:space="preserve">LSTM</w:t>
+      </w:r>
+      <w:r>
+        <w:t xml:space="preserve"> </w:t>
+      </w:r>
+      <w:r>
+        <w:t xml:space="preserve">gjennom et sekvensvindu på</w:t>
+      </w:r>
+      <w:r>
+        <w:t xml:space="preserve"> </w:t>
+      </w:r>
+      <w:r>
+        <w:rPr>
+          <w:rStyle w:val="VerbatimChar"/>
+        </w:rPr>
+        <w:t xml:space="preserve">12</w:t>
+      </w:r>
+      <w:r>
+        <w:t xml:space="preserve"> </w:t>
+      </w:r>
+      <w:r>
+        <w:t xml:space="preserve">måneder. Valget innebærer ikke at sterk og stabil sesong ble antatt på forhånd, men at modellene skulle få mulighet til å utnytte et årlig mønster dersom det faktisk fantes i dataene.</w:t>
+      </w:r>
+    </w:p>
+    <w:p>
+      <w:pPr>
+        <w:pStyle w:val="BodyText"/>
+      </w:pPr>
+      <w:r>
+        <w:t xml:space="preserve">De to delspørsmålene om når neste nedetid kommer og hvor stor den blir er heller ikke behandlet som to helt separate modelleringsoppgaver i denne studien. I stedet er oppgaven implementert som en månedlig regresjonsoppgave på offhire-prosent. Det betyr at analysen svarer mest direkte på størrelsesspørsmålet, mens timingaspektet leses indirekte gjennom om neste fartøy-måned prognostiseres til null eller positiv offhire.</w:t>
+      </w:r>
+    </w:p>
+    <w:p>
+      <w:pPr>
+        <w:pStyle w:val="BodyText"/>
+      </w:pPr>
+      <w:r>
         <w:t xml:space="preserve">Datasettet renses først og omstruktureres til long-format før det deles i et treningssett for perioden</w:t>
       </w:r>
       <w:r>
@@ -8392,7 +8813,7 @@
         <w:pStyle w:val="FirstParagraph"/>
       </w:pPr>
       <w:r>
-        <w:t xml:space="preserve">For å undersøke om fartøyene med høyest gjennomsnittlig offhire følger like eller ulike mønstre over tid, viser figur 5 de fem fartøyene med høyest gjennomsnittsnivå som egne tidsserier.</w:t>
+        <w:t xml:space="preserve">For å undersøke om fartøyene med høyest gjennomsnittlig offhire følger like eller ulike mønstre over tid, viser figur 5 de fem fartøyene med høyest gjennomsnittsnivå som fem separate delpaneler.</w:t>
       </w:r>
     </w:p>
     <w:p>
@@ -8402,7 +8823,7 @@
       <w:r>
         <w:drawing>
           <wp:inline>
-            <wp:extent cx="6007100" cy="3388829"/>
+            <wp:extent cx="6007100" cy="5763878"/>
             <wp:effectExtent b="0" l="0" r="0" t="0"/>
             <wp:docPr descr="" title="" id="56" name="Picture"/>
             <a:graphic>
@@ -8423,7 +8844,7 @@
                   <pic:spPr bwMode="auto">
                     <a:xfrm>
                       <a:off x="0" y="0"/>
-                      <a:ext cx="6007100" cy="3388829"/>
+                      <a:ext cx="6007100" cy="5763878"/>
                     </a:xfrm>
                     <a:prstGeom prst="rect">
                       <a:avLst/>
@@ -8451,7 +8872,7 @@
           <w:i/>
           <w:iCs/>
         </w:rPr>
-        <w:t xml:space="preserve">Figur 5. Historiske tidsserier for de fem fartøyene med høyest gjennomsnittlig månedlig offhire i datasettet.</w:t>
+        <w:t xml:space="preserve">Figur 5. Historiske tidsserier vist som fem separate delpaneler for fartøyene med høyest gjennomsnittlig månedlig offhire i datasettet.</w:t>
       </w:r>
     </w:p>
     <w:p>
@@ -9117,7 +9538,19 @@
         <w:t xml:space="preserve"> </w:t>
       </w:r>
       <w:r>
-        <w:t xml:space="preserve">ble tillatt der det ga mening, men ikke tvunget frem kun fordi dataene er månedlige.</w:t>
+        <w:t xml:space="preserve">ble tillatt der det ga mening, men ikke tvunget frem kun fordi dataene er månedlige. Når et slikt ledd er med, peker det eksplisitt tilbake på observasjonen</w:t>
+      </w:r>
+      <w:r>
+        <w:t xml:space="preserve"> </w:t>
+      </w:r>
+      <w:r>
+        <w:rPr>
+          <w:rStyle w:val="VerbatimChar"/>
+        </w:rPr>
+        <w:t xml:space="preserve">y_{t-12}</w:t>
+      </w:r>
+      <w:r>
+        <w:t xml:space="preserve">, altså samme måned året før. Dersom denne informasjonen er svak eller ofte null, vil også sesongbidraget naturlig bli lite.</w:t>
       </w:r>
     </w:p>
     <w:p>
@@ -9999,7 +10432,34 @@
         <w:t xml:space="preserve">AAA</w:t>
       </w:r>
       <w:r>
-        <w:t xml:space="preserve">). For konstante serier ble det brukt en eksplisitt konstant-baseline.</w:t>
+        <w:t xml:space="preserve">). For konstante serier ble det brukt en eksplisitt konstant-baseline. At bare ett fartøy endte med en eksplisitt</w:t>
+      </w:r>
+      <w:r>
+        <w:t xml:space="preserve"> </w:t>
+      </w:r>
+      <w:r>
+        <w:rPr>
+          <w:rStyle w:val="VerbatimChar"/>
+        </w:rPr>
+        <w:t xml:space="preserve">AAA</w:t>
+      </w:r>
+      <w:r>
+        <w:t xml:space="preserve">-modell tyder samtidig på at et sterkt og stabilt årlig sesongsignal med periode</w:t>
+      </w:r>
+      <w:r>
+        <w:t xml:space="preserve"> </w:t>
+      </w:r>
+      <w:r>
+        <w:rPr>
+          <w:rStyle w:val="VerbatimChar"/>
+        </w:rPr>
+        <w:t xml:space="preserve">12</w:t>
+      </w:r>
+      <w:r>
+        <w:t xml:space="preserve"> </w:t>
+      </w:r>
+      <w:r>
+        <w:t xml:space="preserve">har begrenset empirisk støtte i store deler av datasettet.</w:t>
       </w:r>
     </w:p>
     <w:p>
@@ -10567,7 +11027,34 @@
         <w:t xml:space="preserve">special_flag</w:t>
       </w:r>
       <w:r>
-        <w:t xml:space="preserve">.</w:t>
+        <w:t xml:space="preserve">. Det er derfor misvisende å beskrive denne modellen som om den bare tar et gjennomsnitt av nullmåneder.</w:t>
+      </w:r>
+      <w:r>
+        <w:t xml:space="preserve"> </w:t>
+      </w:r>
+      <w:r>
+        <w:rPr>
+          <w:rStyle w:val="VerbatimChar"/>
+        </w:rPr>
+        <w:t xml:space="preserve">XGBoost</w:t>
+      </w:r>
+      <w:r>
+        <w:t xml:space="preserve"> </w:t>
+      </w:r>
+      <w:r>
+        <w:t xml:space="preserve">bruker samtidig korte lags,</w:t>
+      </w:r>
+      <w:r>
+        <w:t xml:space="preserve"> </w:t>
+      </w:r>
+      <w:r>
+        <w:rPr>
+          <w:rStyle w:val="VerbatimChar"/>
+        </w:rPr>
+        <w:t xml:space="preserve">lag_12</w:t>
+      </w:r>
+      <w:r>
+        <w:t xml:space="preserve">, rullerende gjennomsnitt, rullerende standardavvik og fartøyspesifikke indikatorer. Likevel kan den observerte amplituden bli dempet i et nulltungt datasett fordi flere av disse feature-ene ofte får moderate verdier når historikken domineres av lange nullperioder og få ekstreme topper.</w:t>
       </w:r>
     </w:p>
     <w:tbl>
@@ -11158,7 +11645,22 @@
         <w:t xml:space="preserve"> </w:t>
       </w:r>
       <w:r>
-        <w:t xml:space="preserve">og enkelte fartøyindikatorer bidrar mye. Dette er konsistent med at problemet både har tidsseriepreg og tydelig fartøyheterogenitet.</w:t>
+        <w:t xml:space="preserve">og enkelte fartøyindikatorer bidrar mye, mens</w:t>
+      </w:r>
+      <w:r>
+        <w:t xml:space="preserve"> </w:t>
+      </w:r>
+      <w:r>
+        <w:rPr>
+          <w:rStyle w:val="VerbatimChar"/>
+        </w:rPr>
+        <w:t xml:space="preserve">lag_12</w:t>
+      </w:r>
+      <w:r>
+        <w:t xml:space="preserve"> </w:t>
+      </w:r>
+      <w:r>
+        <w:t xml:space="preserve">bidrar mer moderat. Dette er konsistent med at problemet både har tidsseriepreg og tydelig fartøyheterogenitet, men også med at samme måned året før ikke alltid gir et sterkt signal i dette materialet.</w:t>
       </w:r>
     </w:p>
     <w:p>
@@ -11620,7 +12122,19 @@
         <w:t xml:space="preserve">special_flag</w:t>
       </w:r>
       <w:r>
-        <w:t xml:space="preserve">. All skalering ble estimert på treningsdata. Modellen ble deretter re-trent måned for måned i samme ekspanderende testoppsett som de øvrige modellene.</w:t>
+        <w:t xml:space="preserve">. All skalering ble estimert på treningsdata. Modellen ble deretter re-trent måned for måned i samme ekspanderende testoppsett som de øvrige modellene. Også her betyr</w:t>
+      </w:r>
+      <w:r>
+        <w:t xml:space="preserve"> </w:t>
+      </w:r>
+      <w:r>
+        <w:rPr>
+          <w:rStyle w:val="VerbatimChar"/>
+        </w:rPr>
+        <w:t xml:space="preserve">12</w:t>
+      </w:r>
+      <w:r>
+        <w:t xml:space="preserve">-månedersmekanismen at modellen får se ett helt års historikk, men ikke at samme måned året før automatisk gis størst vekt. Hvis store deler av sekvensen består av nuller eller rolige perioder, kan resultatet bli et mer dempet prognosenivå.</w:t>
       </w:r>
     </w:p>
     <w:p>
@@ -12304,6 +12818,14 @@
         <w:pStyle w:val="BodyText"/>
       </w:pPr>
       <w:r>
+        <w:t xml:space="preserve">Den iterative logikken er viktig for tolkningen av amplituden i framtidsprognosene. Når modeller mates med sine egne tidligere prediksjoner, kan banene enten bli dempet eller forsterket avhengig av hvor sterke signaler de siste prognosene gir. I et nulltungt datasett vil dette ofte trekke modellene mot moderate nivåer, men for enkelte fartøy kan samme mekanisme også forsterke positive prognoser dersom rekursive features begynner å bygge på hverandre.</w:t>
+      </w:r>
+    </w:p>
+    <w:p>
+      <w:pPr>
+        <w:pStyle w:val="BodyText"/>
+      </w:pPr>
+      <w:r>
         <w:t xml:space="preserve">Fremtidsprognosene evalueres ikke med</w:t>
       </w:r>
       <w:r>
@@ -13923,7 +14445,7 @@
         <w:t xml:space="preserve"> </w:t>
       </w:r>
       <w:r>
-        <w:t xml:space="preserve">prognostiserte offhire-enheter.</w:t>
+        <w:t xml:space="preserve">prognostiserte offhire-enheter. Allerede her blir det tydelig at lav amplitude ikke er en generell egenskap ved alle modellene, men en modellspesifikk konsekvens av hvordan historikk, sesong og rekursjon kombineres.</w:t>
       </w:r>
     </w:p>
     <w:tbl>
@@ -14372,7 +14894,52 @@
         <w:t xml:space="preserve"> </w:t>
       </w:r>
       <w:r>
-        <w:t xml:space="preserve">i alle måneder unntatt april.</w:t>
+        <w:t xml:space="preserve">i alle måneder unntatt april. Resultatet understøtter at</w:t>
+      </w:r>
+      <w:r>
+        <w:t xml:space="preserve"> </w:t>
+      </w:r>
+      <w:r>
+        <w:rPr>
+          <w:rStyle w:val="VerbatimChar"/>
+        </w:rPr>
+        <w:t xml:space="preserve">ETS</w:t>
+      </w:r>
+      <w:r>
+        <w:t xml:space="preserve"> </w:t>
+      </w:r>
+      <w:r>
+        <w:t xml:space="preserve">og delvis</w:t>
+      </w:r>
+      <w:r>
+        <w:t xml:space="preserve"> </w:t>
+      </w:r>
+      <w:r>
+        <w:rPr>
+          <w:rStyle w:val="VerbatimChar"/>
+        </w:rPr>
+        <w:t xml:space="preserve">LSTM</w:t>
+      </w:r>
+      <w:r>
+        <w:t xml:space="preserve"> </w:t>
+      </w:r>
+      <w:r>
+        <w:t xml:space="preserve">reagerer mer dempet når de ikke finner et sterkt og stabilt signal, mens</w:t>
+      </w:r>
+      <w:r>
+        <w:t xml:space="preserve"> </w:t>
+      </w:r>
+      <w:r>
+        <w:rPr>
+          <w:rStyle w:val="VerbatimChar"/>
+        </w:rPr>
+        <w:t xml:space="preserve">XGBoost</w:t>
+      </w:r>
+      <w:r>
+        <w:t xml:space="preserve"> </w:t>
+      </w:r>
+      <w:r>
+        <w:t xml:space="preserve">i større grad kan slå ut når rekursive feature-verdier begynner å bygge opp høyere nivåer for enkelte fartøy.</w:t>
       </w:r>
     </w:p>
     <w:tbl>
@@ -15094,7 +15661,7 @@
         <w:t xml:space="preserve">2027</w:t>
       </w:r>
       <w:r>
-        <w:t xml:space="preserve">.</w:t>
+        <w:t xml:space="preserve">. Dette viser også at forklaringen på modellatferden ikke kan reduseres til at alle modellene glatter mot null: noen blir flate, noen blir dempet, og noen kan bli klart forsterkende over lengre horisonter.</w:t>
       </w:r>
     </w:p>
     <w:tbl>
@@ -16066,7 +16633,7 @@
         <w:pStyle w:val="BodyText"/>
       </w:pPr>
       <w:r>
-        <w:t xml:space="preserve">Samlet viser fremtidsprognosene at modellene gir ganske ulike framtidsbilder, spesielt når horisonten blir lengre. På kort sikt peker de alle mot at offhire fortsatt vil være konsentrert rundt noen få fartøy, men på lengre sikt varierer både nivå og utviklingsform betydelig. Dette betyr at de historiske testresultatene blir viktige som tolkningsramme: prognosene bør ikke leses isolert, men i lys av hvilken modell som faktisk presterte best på kjent historikk.</w:t>
+        <w:t xml:space="preserve">Samlet viser fremtidsprognosene at modellene gir ganske ulike framtidsbilder, spesielt når horisonten blir lengre. På kort sikt peker de alle mot at offhire fortsatt vil være konsentrert rundt noen få fartøy, men på lengre sikt varierer både nivå og utviklingsform betydelig. Dette betyr at de historiske testresultatene blir viktige som tolkningsramme: prognosene bør ikke leses isolert, men i lys av hvilken modell som faktisk presterte best på kjent historikk. Det er også her det blir viktig å skille mellom spørsmålet om når neste nedetid kommer og hvor stor den blir. Modellene gir først og fremst nivåprognoser for neste fartøy-måned, mens timingdimensjonen må leses ut av om nivået er null eller positivt.</w:t>
       </w:r>
     </w:p>
     <w:bookmarkEnd w:id="120"/>
@@ -16307,6 +16874,41 @@
         <w:pStyle w:val="BodyText"/>
       </w:pPr>
       <w:r>
+        <w:t xml:space="preserve">Den felles</w:t>
+      </w:r>
+      <w:r>
+        <w:t xml:space="preserve"> </w:t>
+      </w:r>
+      <w:r>
+        <w:rPr>
+          <w:rStyle w:val="VerbatimChar"/>
+        </w:rPr>
+        <w:t xml:space="preserve">12</w:t>
+      </w:r>
+      <w:r>
+        <w:t xml:space="preserve">-månedersmekanismen er også viktig i denne tolkningen. Fordi dataene er månedlige, er ett år det mest naturlige stedet å lete etter sesong. Samtidig er det ikke gitt at samme måned året før faktisk inneholder mye relevant informasjon i et datasett der lange nullperioder brytes av uregelmessige topper. Når</w:t>
+      </w:r>
+      <w:r>
+        <w:t xml:space="preserve"> </w:t>
+      </w:r>
+      <w:r>
+        <w:rPr>
+          <w:rStyle w:val="VerbatimChar"/>
+        </w:rPr>
+        <w:t xml:space="preserve">y_{t-12}</w:t>
+      </w:r>
+      <w:r>
+        <w:t xml:space="preserve"> </w:t>
+      </w:r>
+      <w:r>
+        <w:t xml:space="preserve">eller tilsvarende årshistorikk ofte er null eller lite informativ, blir bidraget fra autokorrelasjon og sesongledd naturlig svakt. Dette er en viktig forklaring på hvorfor flere modeller får lave eller moderate amplituder i deler av prognoseforløpet, selv om de er metodisk fornuftige gitt datasettet.</w:t>
+      </w:r>
+    </w:p>
+    <w:p>
+      <w:pPr>
+        <w:pStyle w:val="BodyText"/>
+      </w:pPr>
+      <w:r>
         <w:t xml:space="preserve">Resultatene må også forstås i lys av at offshoresegmentet opererer i et volatilt marked. Rederier i olje- og gassrelatert aktivitet påvirkes indirekte av svingninger i energipriser, investeringsnivå, kontraktsaktivitet og globale forhold (Menon Economics, 2026). Studien modellerer ikke slike drivere eksplisitt, men de er en viktig del av bakgrunnen for at operasjonell tilgjengelighet ikke nødvendigvis utvikler seg jevnt over tid. Det betyr at datasettets uregelmessighet ikke bare er et teknisk dataproblem, men også et uttrykk for at fartøyene opererer i en usikker og skiftende kontekst.</w:t>
       </w:r>
     </w:p>
@@ -16345,6 +16947,53 @@
         <w:pStyle w:val="BodyText"/>
       </w:pPr>
       <w:r>
+        <w:t xml:space="preserve">Her blir det også tydelig at kommentaren om lav amplitude må forstås nyansert. Den lave amplituden gjelder særlig eksponentiell glatting og deler av</w:t>
+      </w:r>
+      <w:r>
+        <w:t xml:space="preserve"> </w:t>
+      </w:r>
+      <w:r>
+        <w:rPr>
+          <w:rStyle w:val="VerbatimChar"/>
+        </w:rPr>
+        <w:t xml:space="preserve">LSTM</w:t>
+      </w:r>
+      <w:r>
+        <w:t xml:space="preserve">-forløpet, der</w:t>
+      </w:r>
+      <w:r>
+        <w:t xml:space="preserve"> </w:t>
+      </w:r>
+      <w:r>
+        <w:rPr>
+          <w:rStyle w:val="VerbatimChar"/>
+        </w:rPr>
+        <w:t xml:space="preserve">12</w:t>
+      </w:r>
+      <w:r>
+        <w:t xml:space="preserve">-månedershistorikken og den nulltunge datastrukturen trekker prognosene mot mer moderate nivåer. For</w:t>
+      </w:r>
+      <w:r>
+        <w:t xml:space="preserve"> </w:t>
+      </w:r>
+      <w:r>
+        <w:rPr>
+          <w:rStyle w:val="VerbatimChar"/>
+        </w:rPr>
+        <w:t xml:space="preserve">XGBoost</w:t>
+      </w:r>
+      <w:r>
+        <w:t xml:space="preserve"> </w:t>
+      </w:r>
+      <w:r>
+        <w:t xml:space="preserve">er bildet annerledes: modellen er ikke et enkelt gjennomsnitt av nuller, men en kombinasjon av flere lags, glidende mål, variasjonsmål og fartøyeffekter. I fler-stegsprognoser kan disse feature-ene, sammen med rekursive prediksjoner, gjøre at enkelte fartøy får stadig høyere nivåer og dermed trekker samlet prognose kraftig opp.</w:t>
+      </w:r>
+    </w:p>
+    <w:p>
+      <w:pPr>
+        <w:pStyle w:val="BodyText"/>
+      </w:pPr>
+      <w:r>
         <w:t xml:space="preserve">Dette spriket betyr ikke nødvendigvis at én modell er feil og de andre riktige. Det viser først og fremst at usikkerheten øker når prognosehorisonten forlenges. I en næring preget av stor markedsmessig volatilitet blir dette særlig viktig. Rammebetingelsene kan endre seg raskt, og studien inkluderer ikke eksterne drivere som kan fange opp slike skift direkte. Derfor framstår de kortere prognosehorisontene på</w:t>
       </w:r>
       <w:r>
@@ -16388,6 +17037,14 @@
       </w:r>
       <w:r>
         <w:t xml:space="preserve">-månedersprognosene. For Simon Møkster Shipping AS betyr dette at prognosene først og fremst bør brukes som beslutningsstøtte for kortsiktig kapasitetsplanlegging, oppfølging av fartøy med høy historisk offhire og som et supplement til operasjonell vurdering, ikke som et automatisk beslutningsgrunnlag.</w:t>
+      </w:r>
+    </w:p>
+    <w:p>
+      <w:pPr>
+        <w:pStyle w:val="BodyText"/>
+      </w:pPr>
+      <w:r>
+        <w:t xml:space="preserve">Sett opp mot delspørsmålene betyr dette også at studien er sterkest på spørsmålet om hvor stor neste nedetid kan bli innenfor en månedlig planleggingshorisont. Spørsmålet om nøyaktig når neste nedetid inntreffer blir bare delvis besvart, fordi timing her er bundet til den månedlige oppløsningen og til om modellen predikerer null eller positiv verdi for neste periode.</w:t>
       </w:r>
     </w:p>
     <w:bookmarkEnd w:id="125"/>
@@ -16662,6 +17319,14 @@
       </w:r>
       <w:r>
         <w:t xml:space="preserve">fungerte som en nyttig, men svakere benchmark. Problemstillingen kan dermed besvares med at valg av modell har betydning, og at klassiske tidsseriemodeller i dette datasettet ga høyest prediksjonsnøyaktighet.</w:t>
+      </w:r>
+    </w:p>
+    <w:p>
+      <w:pPr>
+        <w:pStyle w:val="BodyText"/>
+      </w:pPr>
+      <w:r>
+        <w:t xml:space="preserve">Sett opp mot delspørsmålene betyr dette at oppgaven gir det tydeligste svaret på hvor stor neste nedetid kan bli på månedlig nivå, mens spørsmålet om nøyaktig når neste nedetid kommer bare kan besvares indirekte gjennom om neste periode prognostiseres til null eller positiv offhire.</w:t>
       </w:r>
     </w:p>
     <w:p>
@@ -17344,7 +18009,7 @@
               <w:pStyle w:val="Compact"/>
             </w:pPr>
             <w:r>
-              <w:t xml:space="preserve">Viser utviklingen for de mest utsatte fartøyene</w:t>
+              <w:t xml:space="preserve">Viser utviklingen for de mest utsatte fartøyene i fem delpaneler</w:t>
             </w:r>
           </w:p>
         </w:tc>
@@ -36883,6 +37548,91 @@
       <w:rPr>
         <w:rFonts w:ascii="Wingdings" w:hAnsi="Wingdings" w:cs="Wingdings" w:hint="default"/>
       </w:rPr>
+    </w:lvl>
+  </w:abstractNum>
+  <w:abstractNum w:abstractNumId="99411">
+    <w:nsid w:val="00A99411"/>
+    <w:multiLevelType w:val="multilevel"/>
+    <w:lvl w:ilvl="0">
+      <w:start w:val="1"/>
+      <w:numFmt w:val="decimal"/>
+      <w:lvlText w:val="%1."/>
+      <w:lvlJc w:val="left"/>
+      <w:pPr>
+        <w:ind w:left="720" w:hanging="360"/>
+      </w:pPr>
+    </w:lvl>
+    <w:lvl w:ilvl="1">
+      <w:start w:val="1"/>
+      <w:numFmt w:val="decimal"/>
+      <w:lvlText w:val="%2."/>
+      <w:lvlJc w:val="left"/>
+      <w:pPr>
+        <w:ind w:left="1440" w:hanging="360"/>
+      </w:pPr>
+    </w:lvl>
+    <w:lvl w:ilvl="2">
+      <w:start w:val="1"/>
+      <w:numFmt w:val="decimal"/>
+      <w:lvlText w:val="%3."/>
+      <w:lvlJc w:val="left"/>
+      <w:pPr>
+        <w:ind w:left="2160" w:hanging="360"/>
+      </w:pPr>
+    </w:lvl>
+    <w:lvl w:ilvl="3">
+      <w:start w:val="1"/>
+      <w:numFmt w:val="decimal"/>
+      <w:lvlText w:val="%4."/>
+      <w:lvlJc w:val="left"/>
+      <w:pPr>
+        <w:ind w:left="2880" w:hanging="360"/>
+      </w:pPr>
+    </w:lvl>
+    <w:lvl w:ilvl="4">
+      <w:start w:val="1"/>
+      <w:numFmt w:val="decimal"/>
+      <w:lvlText w:val="%5."/>
+      <w:lvlJc w:val="left"/>
+      <w:pPr>
+        <w:ind w:left="3600" w:hanging="360"/>
+      </w:pPr>
+    </w:lvl>
+    <w:lvl w:ilvl="5">
+      <w:start w:val="1"/>
+      <w:numFmt w:val="decimal"/>
+      <w:lvlText w:val="%6."/>
+      <w:lvlJc w:val="left"/>
+      <w:pPr>
+        <w:ind w:left="4320" w:hanging="360"/>
+      </w:pPr>
+    </w:lvl>
+    <w:lvl w:ilvl="6">
+      <w:start w:val="1"/>
+      <w:numFmt w:val="decimal"/>
+      <w:lvlText w:val="%7."/>
+      <w:lvlJc w:val="left"/>
+      <w:pPr>
+        <w:ind w:left="5040" w:hanging="360"/>
+      </w:pPr>
+    </w:lvl>
+    <w:lvl w:ilvl="7">
+      <w:start w:val="1"/>
+      <w:numFmt w:val="decimal"/>
+      <w:lvlText w:val="%8."/>
+      <w:lvlJc w:val="left"/>
+      <w:pPr>
+        <w:ind w:left="5760" w:hanging="360"/>
+      </w:pPr>
+    </w:lvl>
+    <w:lvl w:ilvl="8">
+      <w:start w:val="1"/>
+      <w:numFmt w:val="decimal"/>
+      <w:lvlText w:val="%9."/>
+      <w:lvlJc w:val="left"/>
+      <w:pPr>
+        <w:ind w:left="6480" w:hanging="360"/>
+      </w:pPr>
     </w:lvl>
   </w:abstractNum>
   <w:num w16cid:durableId="1334993841" w:numId="1">
@@ -37046,6 +37796,36 @@
   </w:num>
   <w:num w:numId="1002">
     <w:abstractNumId w:val="991"/>
+  </w:num>
+  <w:num w:numId="1003">
+    <w:abstractNumId w:val="99411"/>
+    <w:lvlOverride w:ilvl="0">
+      <w:startOverride w:val="1"/>
+    </w:lvlOverride>
+    <w:lvlOverride w:ilvl="1">
+      <w:startOverride w:val="1"/>
+    </w:lvlOverride>
+    <w:lvlOverride w:ilvl="2">
+      <w:startOverride w:val="1"/>
+    </w:lvlOverride>
+    <w:lvlOverride w:ilvl="3">
+      <w:startOverride w:val="1"/>
+    </w:lvlOverride>
+    <w:lvlOverride w:ilvl="4">
+      <w:startOverride w:val="1"/>
+    </w:lvlOverride>
+    <w:lvlOverride w:ilvl="5">
+      <w:startOverride w:val="1"/>
+    </w:lvlOverride>
+    <w:lvlOverride w:ilvl="6">
+      <w:startOverride w:val="1"/>
+    </w:lvlOverride>
+    <w:lvlOverride w:ilvl="7">
+      <w:startOverride w:val="1"/>
+    </w:lvlOverride>
+    <w:lvlOverride w:ilvl="8">
+      <w:startOverride w:val="1"/>
+    </w:lvlOverride>
   </w:num>
 </w:numbering>
 </file>

</xml_diff>

<commit_message>
Add MASE evaluation and clarify representative vessel
</commit_message>
<xml_diff>
--- a/014 fase 4 - report/Rapport.docx
+++ b/014 fase 4 - report/Rapport.docx
@@ -514,6 +514,18 @@
         <w:t xml:space="preserve">RMSE</w:t>
       </w:r>
       <w:r>
+        <w:t xml:space="preserve">,</w:t>
+      </w:r>
+      <w:r>
+        <w:t xml:space="preserve"> </w:t>
+      </w:r>
+      <w:r>
+        <w:rPr>
+          <w:rStyle w:val="VerbatimChar"/>
+        </w:rPr>
+        <w:t xml:space="preserve">sMAPE</w:t>
+      </w:r>
+      <w:r>
         <w:t xml:space="preserve"> </w:t>
       </w:r>
       <w:r>
@@ -526,7 +538,7 @@
         <w:rPr>
           <w:rStyle w:val="VerbatimChar"/>
         </w:rPr>
-        <w:t xml:space="preserve">sMAPE</w:t>
+        <w:t xml:space="preserve">MASE</w:t>
       </w:r>
       <w:r>
         <w:t xml:space="preserve">.</w:t>
@@ -564,6 +576,18 @@
         <w:t xml:space="preserve">MAE</w:t>
       </w:r>
       <w:r>
+        <w:t xml:space="preserve">,</w:t>
+      </w:r>
+      <w:r>
+        <w:t xml:space="preserve"> </w:t>
+      </w:r>
+      <w:r>
+        <w:rPr>
+          <w:rStyle w:val="VerbatimChar"/>
+        </w:rPr>
+        <w:t xml:space="preserve">RMSE</w:t>
+      </w:r>
+      <w:r>
         <w:t xml:space="preserve"> </w:t>
       </w:r>
       <w:r>
@@ -576,13 +600,85 @@
         <w:rPr>
           <w:rStyle w:val="VerbatimChar"/>
         </w:rPr>
+        <w:t xml:space="preserve">MASE</w:t>
+      </w:r>
+      <w:r>
+        <w:t xml:space="preserve"> </w:t>
+      </w:r>
+      <w:r>
+        <w:t xml:space="preserve">i den historiske testen, mens</w:t>
+      </w:r>
+      <w:r>
+        <w:t xml:space="preserve"> </w:t>
+      </w:r>
+      <w:r>
+        <w:rPr>
+          <w:rStyle w:val="VerbatimChar"/>
+        </w:rPr>
+        <w:t xml:space="preserve">XGBoost</w:t>
+      </w:r>
+      <w:r>
+        <w:t xml:space="preserve"> </w:t>
+      </w:r>
+      <w:r>
+        <w:t xml:space="preserve">og</w:t>
+      </w:r>
+      <w:r>
+        <w:t xml:space="preserve"> </w:t>
+      </w:r>
+      <w:r>
+        <w:rPr>
+          <w:rStyle w:val="VerbatimChar"/>
+        </w:rPr>
+        <w:t xml:space="preserve">LSTM</w:t>
+      </w:r>
+      <w:r>
+        <w:t xml:space="preserve"> </w:t>
+      </w:r>
+      <w:r>
+        <w:t xml:space="preserve">var konkurransedyktige på absolutt feil uten å overgå den beste klassiske modellen.</w:t>
+      </w:r>
+      <w:r>
+        <w:t xml:space="preserve"> </w:t>
+      </w:r>
+      <w:r>
+        <w:rPr>
+          <w:rStyle w:val="VerbatimChar"/>
+        </w:rPr>
+        <w:t xml:space="preserve">Eksponentiell glatting</w:t>
+      </w:r>
+      <w:r>
+        <w:t xml:space="preserve"> </w:t>
+      </w:r>
+      <w:r>
+        <w:t xml:space="preserve">fungerte som en nyttig benchmark og kom svakere ut på</w:t>
+      </w:r>
+      <w:r>
+        <w:t xml:space="preserve"> </w:t>
+      </w:r>
+      <w:r>
+        <w:rPr>
+          <w:rStyle w:val="VerbatimChar"/>
+        </w:rPr>
+        <w:t xml:space="preserve">MAE</w:t>
+      </w:r>
+      <w:r>
+        <w:t xml:space="preserve"> </w:t>
+      </w:r>
+      <w:r>
+        <w:t xml:space="preserve">og</w:t>
+      </w:r>
+      <w:r>
+        <w:t xml:space="preserve"> </w:t>
+      </w:r>
+      <w:r>
+        <w:rPr>
+          <w:rStyle w:val="VerbatimChar"/>
+        </w:rPr>
         <w:t xml:space="preserve">RMSE</w:t>
       </w:r>
       <w:r>
-        <w:t xml:space="preserve"> </w:t>
-      </w:r>
-      <w:r>
-        <w:t xml:space="preserve">i den historiske testen, mens</w:t>
+        <w:t xml:space="preserve">, men noe bedre enn</w:t>
       </w:r>
       <w:r>
         <w:t xml:space="preserve"> </w:t>
@@ -612,22 +708,19 @@
         <w:t xml:space="preserve"> </w:t>
       </w:r>
       <w:r>
-        <w:t xml:space="preserve">var konkurransedyktige uten å overgå den beste klassiske modellen.</w:t>
-      </w:r>
-      <w:r>
-        <w:t xml:space="preserve"> </w:t>
-      </w:r>
-      <w:r>
-        <w:rPr>
-          <w:rStyle w:val="VerbatimChar"/>
-        </w:rPr>
-        <w:t xml:space="preserve">Eksponentiell glatting</w:t>
-      </w:r>
-      <w:r>
-        <w:t xml:space="preserve"> </w:t>
-      </w:r>
-      <w:r>
-        <w:t xml:space="preserve">fungerte som en nyttig, men svakere benchmark. Fremtidsprognosene for</w:t>
+        <w:t xml:space="preserve">på</w:t>
+      </w:r>
+      <w:r>
+        <w:t xml:space="preserve"> </w:t>
+      </w:r>
+      <w:r>
+        <w:rPr>
+          <w:rStyle w:val="VerbatimChar"/>
+        </w:rPr>
+        <w:t xml:space="preserve">MASE</w:t>
+      </w:r>
+      <w:r>
+        <w:t xml:space="preserve">. Fremtidsprognosene for</w:t>
       </w:r>
       <w:r>
         <w:t xml:space="preserve"> </w:t>
@@ -804,6 +897,18 @@
         <w:t xml:space="preserve">RMSE</w:t>
       </w:r>
       <w:r>
+        <w:t xml:space="preserve">,</w:t>
+      </w:r>
+      <w:r>
+        <w:t xml:space="preserve"> </w:t>
+      </w:r>
+      <w:r>
+        <w:rPr>
+          <w:rStyle w:val="VerbatimChar"/>
+        </w:rPr>
+        <w:t xml:space="preserve">sMAPE</w:t>
+      </w:r>
+      <w:r>
         <w:t xml:space="preserve">, and</w:t>
       </w:r>
       <w:r>
@@ -813,7 +918,7 @@
         <w:rPr>
           <w:rStyle w:val="VerbatimChar"/>
         </w:rPr>
-        <w:t xml:space="preserve">sMAPE</w:t>
+        <w:t xml:space="preserve">MASE</w:t>
       </w:r>
       <w:r>
         <w:t xml:space="preserve">.</w:t>
@@ -851,6 +956,45 @@
         <w:t xml:space="preserve">MAE</w:t>
       </w:r>
       <w:r>
+        <w:t xml:space="preserve">,</w:t>
+      </w:r>
+      <w:r>
+        <w:t xml:space="preserve"> </w:t>
+      </w:r>
+      <w:r>
+        <w:rPr>
+          <w:rStyle w:val="VerbatimChar"/>
+        </w:rPr>
+        <w:t xml:space="preserve">RMSE</w:t>
+      </w:r>
+      <w:r>
+        <w:t xml:space="preserve">, and</w:t>
+      </w:r>
+      <w:r>
+        <w:t xml:space="preserve"> </w:t>
+      </w:r>
+      <w:r>
+        <w:rPr>
+          <w:rStyle w:val="VerbatimChar"/>
+        </w:rPr>
+        <w:t xml:space="preserve">MASE</w:t>
+      </w:r>
+      <w:r>
+        <w:t xml:space="preserve"> </w:t>
+      </w:r>
+      <w:r>
+        <w:t xml:space="preserve">in the historical test, while</w:t>
+      </w:r>
+      <w:r>
+        <w:t xml:space="preserve"> </w:t>
+      </w:r>
+      <w:r>
+        <w:rPr>
+          <w:rStyle w:val="VerbatimChar"/>
+        </w:rPr>
+        <w:t xml:space="preserve">XGBoost</w:t>
+      </w:r>
+      <w:r>
         <w:t xml:space="preserve"> </w:t>
       </w:r>
       <w:r>
@@ -863,13 +1007,55 @@
         <w:rPr>
           <w:rStyle w:val="VerbatimChar"/>
         </w:rPr>
+        <w:t xml:space="preserve">LSTM</w:t>
+      </w:r>
+      <w:r>
+        <w:t xml:space="preserve"> </w:t>
+      </w:r>
+      <w:r>
+        <w:t xml:space="preserve">were competitive on absolute error without outperforming the best classical model.</w:t>
+      </w:r>
+      <w:r>
+        <w:t xml:space="preserve"> </w:t>
+      </w:r>
+      <w:r>
+        <w:rPr>
+          <w:rStyle w:val="VerbatimChar"/>
+        </w:rPr>
+        <w:t xml:space="preserve">Exponential smoothing</w:t>
+      </w:r>
+      <w:r>
+        <w:t xml:space="preserve"> </w:t>
+      </w:r>
+      <w:r>
+        <w:t xml:space="preserve">served as a useful benchmark and performed worse on</w:t>
+      </w:r>
+      <w:r>
+        <w:t xml:space="preserve"> </w:t>
+      </w:r>
+      <w:r>
+        <w:rPr>
+          <w:rStyle w:val="VerbatimChar"/>
+        </w:rPr>
+        <w:t xml:space="preserve">MAE</w:t>
+      </w:r>
+      <w:r>
+        <w:t xml:space="preserve"> </w:t>
+      </w:r>
+      <w:r>
+        <w:t xml:space="preserve">and</w:t>
+      </w:r>
+      <w:r>
+        <w:t xml:space="preserve"> </w:t>
+      </w:r>
+      <w:r>
+        <w:rPr>
+          <w:rStyle w:val="VerbatimChar"/>
+        </w:rPr>
         <w:t xml:space="preserve">RMSE</w:t>
       </w:r>
       <w:r>
-        <w:t xml:space="preserve"> </w:t>
-      </w:r>
-      <w:r>
-        <w:t xml:space="preserve">in the historical test, while</w:t>
+        <w:t xml:space="preserve">, but slightly better than</w:t>
       </w:r>
       <w:r>
         <w:t xml:space="preserve"> </w:t>
@@ -899,22 +1085,19 @@
         <w:t xml:space="preserve"> </w:t>
       </w:r>
       <w:r>
-        <w:t xml:space="preserve">were competitive without outperforming the best classical model.</w:t>
-      </w:r>
-      <w:r>
-        <w:t xml:space="preserve"> </w:t>
-      </w:r>
-      <w:r>
-        <w:rPr>
-          <w:rStyle w:val="VerbatimChar"/>
-        </w:rPr>
-        <w:t xml:space="preserve">Exponential smoothing</w:t>
-      </w:r>
-      <w:r>
-        <w:t xml:space="preserve"> </w:t>
-      </w:r>
-      <w:r>
-        <w:t xml:space="preserve">served as a useful but weaker benchmark. The future forecasts for</w:t>
+        <w:t xml:space="preserve">on</w:t>
+      </w:r>
+      <w:r>
+        <w:t xml:space="preserve"> </w:t>
+      </w:r>
+      <w:r>
+        <w:rPr>
+          <w:rStyle w:val="VerbatimChar"/>
+        </w:rPr>
+        <w:t xml:space="preserve">MASE</w:t>
+      </w:r>
+      <w:r>
+        <w:t xml:space="preserve">. The future forecasts for</w:t>
       </w:r>
       <w:r>
         <w:t xml:space="preserve"> </w:t>
@@ -6938,7 +7121,34 @@
         <w:t xml:space="preserve"> </w:t>
       </w:r>
       <w:r>
-        <w:t xml:space="preserve">brukes ofte som et skaleringsuavhengig prosentmål, men kan være mer krevende å tolke når serien inneholder mange null- eller nær-nullverdier. Samlet betyr dette at modellvurdering normalt må forstås som en avveiing mellom prediktiv nøyaktighet, robusthet, tolkbarhet og datakrav, heller enn som en jakt på lavest mulig verdi i én enkelt metrikk (Kolassa, 2022; Schmid et al., 2025).</w:t>
+        <w:t xml:space="preserve">brukes ofte som et skaleringsuavhengig prosentmål, men kan være mer krevende å tolke når serien inneholder mange null- eller nær-nullverdier.</w:t>
+      </w:r>
+      <w:r>
+        <w:t xml:space="preserve"> </w:t>
+      </w:r>
+      <w:r>
+        <w:rPr>
+          <w:rStyle w:val="VerbatimChar"/>
+        </w:rPr>
+        <w:t xml:space="preserve">MASE</w:t>
+      </w:r>
+      <w:r>
+        <w:t xml:space="preserve"> </w:t>
+      </w:r>
+      <w:r>
+        <w:t xml:space="preserve">skalerer derimot den absolutte feilen mot en naiv</w:t>
+      </w:r>
+      <w:r>
+        <w:t xml:space="preserve"> </w:t>
+      </w:r>
+      <w:r>
+        <w:rPr>
+          <w:rStyle w:val="VerbatimChar"/>
+        </w:rPr>
+        <w:t xml:space="preserve">lag-1</w:t>
+      </w:r>
+      <w:r>
+        <w:t xml:space="preserve">-baseline og gjør det dermed lettere å vurdere om modellen faktisk forbedrer en enkel referanse på tvers av serier med ulikt nivå. Samlet betyr dette at modellvurdering normalt må forstås som en avveiing mellom prediktiv nøyaktighet, robusthet, tolkbarhet og datakrav, heller enn som en jakt på lavest mulig verdi i én enkelt metrikk (Kolassa, 2022; Schmid et al., 2025).</w:t>
       </w:r>
     </w:p>
     <w:bookmarkEnd w:id="36"/>
@@ -7389,7 +7599,34 @@
         <w:t xml:space="preserve"> </w:t>
       </w:r>
       <w:r>
-        <w:t xml:space="preserve">brukes som et prosentbasert supplement. Siden datasettet er nulltungt og inneholder flere nær-nullverdier, tolkes</w:t>
+        <w:t xml:space="preserve">brukes som et prosentbasert supplement.</w:t>
+      </w:r>
+      <w:r>
+        <w:t xml:space="preserve"> </w:t>
+      </w:r>
+      <w:r>
+        <w:rPr>
+          <w:rStyle w:val="VerbatimChar"/>
+        </w:rPr>
+        <w:t xml:space="preserve">MASE</w:t>
+      </w:r>
+      <w:r>
+        <w:t xml:space="preserve"> </w:t>
+      </w:r>
+      <w:r>
+        <w:t xml:space="preserve">brukes som et ekstra skalert støttemål, der feilene sammenlignes med en naiv</w:t>
+      </w:r>
+      <w:r>
+        <w:t xml:space="preserve"> </w:t>
+      </w:r>
+      <w:r>
+        <w:rPr>
+          <w:rStyle w:val="VerbatimChar"/>
+        </w:rPr>
+        <w:t xml:space="preserve">lag-1</w:t>
+      </w:r>
+      <w:r>
+        <w:t xml:space="preserve">-prognose beregnet fra treningshistorikken. Siden datasettet er nulltungt og inneholder flere nær-nullverdier, tolkes</w:t>
       </w:r>
       <w:r>
         <w:t xml:space="preserve"> </w:t>
@@ -7686,6 +7923,18 @@
         <w:t xml:space="preserve">RMSE</w:t>
       </w:r>
       <w:r>
+        <w:t xml:space="preserve">,</w:t>
+      </w:r>
+      <w:r>
+        <w:t xml:space="preserve"> </w:t>
+      </w:r>
+      <w:r>
+        <w:rPr>
+          <w:rStyle w:val="VerbatimChar"/>
+        </w:rPr>
+        <w:t xml:space="preserve">sMAPE</w:t>
+      </w:r>
+      <w:r>
         <w:t xml:space="preserve"> </w:t>
       </w:r>
       <w:r>
@@ -7698,7 +7947,7 @@
         <w:rPr>
           <w:rStyle w:val="VerbatimChar"/>
         </w:rPr>
-        <w:t xml:space="preserve">sMAPE</w:t>
+        <w:t xml:space="preserve">MASE</w:t>
       </w:r>
       <w:r>
         <w:t xml:space="preserve">. Etter den historiske testfasen brukes hele datasettet som grunnlag for fremtidsprognoser med horisonter på</w:t>
@@ -9304,10 +9553,7 @@
               <w:t xml:space="preserve">RMSE</w:t>
             </w:r>
             <w:r>
-              <w:t xml:space="preserve"> </w:t>
-            </w:r>
-            <w:r>
-              <w:t xml:space="preserve">og</w:t>
+              <w:t xml:space="preserve">,</w:t>
             </w:r>
             <w:r>
               <w:t xml:space="preserve"> </w:t>
@@ -9318,6 +9564,21 @@
               </w:rPr>
               <w:t xml:space="preserve">sMAPE</w:t>
             </w:r>
+            <w:r>
+              <w:t xml:space="preserve"> </w:t>
+            </w:r>
+            <w:r>
+              <w:t xml:space="preserve">og</w:t>
+            </w:r>
+            <w:r>
+              <w:t xml:space="preserve"> </w:t>
+            </w:r>
+            <w:r>
+              <w:rPr>
+                <w:rStyle w:val="VerbatimChar"/>
+              </w:rPr>
+              <w:t xml:space="preserve">MASE</w:t>
+            </w:r>
           </w:p>
         </w:tc>
       </w:tr>
@@ -9619,6 +9880,98 @@
       </w:r>
       <w:r>
         <w:t xml:space="preserve">.</w:t>
+      </w:r>
+    </w:p>
+    <w:p>
+      <w:pPr>
+        <w:pStyle w:val="BodyText"/>
+      </w:pPr>
+      <w:r>
+        <w:rPr>
+          <w:rStyle w:val="VerbatimChar"/>
+        </w:rPr>
+        <w:t xml:space="preserve">Fartøy 2</w:t>
+      </w:r>
+      <w:r>
+        <w:t xml:space="preserve"> </w:t>
+      </w:r>
+      <w:r>
+        <w:t xml:space="preserve">er brukt som representativt eksempel i figurer og modelltabeller, men modellene er ikke trent utelukkende på dette fartøyet. For</w:t>
+      </w:r>
+      <w:r>
+        <w:t xml:space="preserve"> </w:t>
+      </w:r>
+      <w:r>
+        <w:rPr>
+          <w:rStyle w:val="VerbatimChar"/>
+        </w:rPr>
+        <w:t xml:space="preserve">SARIMA</w:t>
+      </w:r>
+      <w:r>
+        <w:t xml:space="preserve"> </w:t>
+      </w:r>
+      <w:r>
+        <w:t xml:space="preserve">og</w:t>
+      </w:r>
+      <w:r>
+        <w:t xml:space="preserve"> </w:t>
+      </w:r>
+      <w:r>
+        <w:rPr>
+          <w:rStyle w:val="VerbatimChar"/>
+        </w:rPr>
+        <w:t xml:space="preserve">eksponentiell glatting</w:t>
+      </w:r>
+      <w:r>
+        <w:t xml:space="preserve"> </w:t>
+      </w:r>
+      <w:r>
+        <w:t xml:space="preserve">estimeres egne modeller for hvert fartøy i datasettet, mens</w:t>
+      </w:r>
+      <w:r>
+        <w:t xml:space="preserve"> </w:t>
+      </w:r>
+      <w:r>
+        <w:rPr>
+          <w:rStyle w:val="VerbatimChar"/>
+        </w:rPr>
+        <w:t xml:space="preserve">XGBoost</w:t>
+      </w:r>
+      <w:r>
+        <w:t xml:space="preserve"> </w:t>
+      </w:r>
+      <w:r>
+        <w:t xml:space="preserve">og</w:t>
+      </w:r>
+      <w:r>
+        <w:t xml:space="preserve"> </w:t>
+      </w:r>
+      <w:r>
+        <w:rPr>
+          <w:rStyle w:val="VerbatimChar"/>
+        </w:rPr>
+        <w:t xml:space="preserve">LSTM</w:t>
+      </w:r>
+      <w:r>
+        <w:t xml:space="preserve"> </w:t>
+      </w:r>
+      <w:r>
+        <w:t xml:space="preserve">trenes på det samlede fartøy-måned-panelet. Valget av</w:t>
+      </w:r>
+      <w:r>
+        <w:t xml:space="preserve"> </w:t>
+      </w:r>
+      <w:r>
+        <w:rPr>
+          <w:rStyle w:val="VerbatimChar"/>
+        </w:rPr>
+        <w:t xml:space="preserve">Fartøy 2</w:t>
+      </w:r>
+      <w:r>
+        <w:t xml:space="preserve"> </w:t>
+      </w:r>
+      <w:r>
+        <w:t xml:space="preserve">gjelder derfor kun presentasjonen av ett illustrativt eksempel, og ble gjort fordi dette fartøyet hadde høyest gjennomsnittlig offhire i treningsgrunnlaget.</w:t>
       </w:r>
     </w:p>
     <w:tbl>
@@ -12997,6 +13350,18 @@
         <w:t xml:space="preserve">RMSE</w:t>
       </w:r>
       <w:r>
+        <w:t xml:space="preserve">,</w:t>
+      </w:r>
+      <w:r>
+        <w:t xml:space="preserve"> </w:t>
+      </w:r>
+      <w:r>
+        <w:rPr>
+          <w:rStyle w:val="VerbatimChar"/>
+        </w:rPr>
+        <w:t xml:space="preserve">sMAPE</w:t>
+      </w:r>
+      <w:r>
         <w:t xml:space="preserve"> </w:t>
       </w:r>
       <w:r>
@@ -13009,13 +13374,40 @@
         <w:rPr>
           <w:rStyle w:val="VerbatimChar"/>
         </w:rPr>
-        <w:t xml:space="preserve">sMAPE</w:t>
-      </w:r>
-      <w:r>
-        <w:t xml:space="preserve"> </w:t>
-      </w:r>
-      <w:r>
-        <w:t xml:space="preserve">brukes som støttemål. Siden datasettet er svært nulltungt, må</w:t>
+        <w:t xml:space="preserve">MASE</w:t>
+      </w:r>
+      <w:r>
+        <w:t xml:space="preserve"> </w:t>
+      </w:r>
+      <w:r>
+        <w:t xml:space="preserve">brukes som støttemål.</w:t>
+      </w:r>
+      <w:r>
+        <w:t xml:space="preserve"> </w:t>
+      </w:r>
+      <w:r>
+        <w:rPr>
+          <w:rStyle w:val="VerbatimChar"/>
+        </w:rPr>
+        <w:t xml:space="preserve">MASE</w:t>
+      </w:r>
+      <w:r>
+        <w:t xml:space="preserve"> </w:t>
+      </w:r>
+      <w:r>
+        <w:t xml:space="preserve">er her skalert mot en naiv</w:t>
+      </w:r>
+      <w:r>
+        <w:t xml:space="preserve"> </w:t>
+      </w:r>
+      <w:r>
+        <w:rPr>
+          <w:rStyle w:val="VerbatimChar"/>
+        </w:rPr>
+        <w:t xml:space="preserve">lag-1</w:t>
+      </w:r>
+      <w:r>
+        <w:t xml:space="preserve">-baseline beregnet fra treningshistorikken per fartøy. Siden datasettet er svært nulltungt, må</w:t>
       </w:r>
       <w:r>
         <w:t xml:space="preserve"> </w:t>
@@ -13065,6 +13457,18 @@
         <w:t xml:space="preserve">MAE</w:t>
       </w:r>
       <w:r>
+        <w:t xml:space="preserve">, lavest</w:t>
+      </w:r>
+      <w:r>
+        <w:t xml:space="preserve"> </w:t>
+      </w:r>
+      <w:r>
+        <w:rPr>
+          <w:rStyle w:val="VerbatimChar"/>
+        </w:rPr>
+        <w:t xml:space="preserve">RMSE</w:t>
+      </w:r>
+      <w:r>
         <w:t xml:space="preserve"> </w:t>
       </w:r>
       <w:r>
@@ -13077,13 +13481,115 @@
         <w:rPr>
           <w:rStyle w:val="VerbatimChar"/>
         </w:rPr>
+        <w:t xml:space="preserve">MASE</w:t>
+      </w:r>
+      <w:r>
+        <w:t xml:space="preserve"> </w:t>
+      </w:r>
+      <w:r>
+        <w:t xml:space="preserve">i siste kjøring.</w:t>
+      </w:r>
+      <w:r>
+        <w:t xml:space="preserve"> </w:t>
+      </w:r>
+      <w:r>
+        <w:rPr>
+          <w:rStyle w:val="VerbatimChar"/>
+        </w:rPr>
+        <w:t xml:space="preserve">XGBoost</w:t>
+      </w:r>
+      <w:r>
+        <w:t xml:space="preserve"> </w:t>
+      </w:r>
+      <w:r>
+        <w:t xml:space="preserve">og</w:t>
+      </w:r>
+      <w:r>
+        <w:t xml:space="preserve"> </w:t>
+      </w:r>
+      <w:r>
+        <w:rPr>
+          <w:rStyle w:val="VerbatimChar"/>
+        </w:rPr>
+        <w:t xml:space="preserve">LSTM</w:t>
+      </w:r>
+      <w:r>
+        <w:t xml:space="preserve"> </w:t>
+      </w:r>
+      <w:r>
+        <w:t xml:space="preserve">ligger fortsatt svært nær hverandre på</w:t>
+      </w:r>
+      <w:r>
+        <w:t xml:space="preserve"> </w:t>
+      </w:r>
+      <w:r>
+        <w:rPr>
+          <w:rStyle w:val="VerbatimChar"/>
+        </w:rPr>
+        <w:t xml:space="preserve">MAE</w:t>
+      </w:r>
+      <w:r>
+        <w:t xml:space="preserve"> </w:t>
+      </w:r>
+      <w:r>
+        <w:t xml:space="preserve">og</w:t>
+      </w:r>
+      <w:r>
+        <w:t xml:space="preserve"> </w:t>
+      </w:r>
+      <w:r>
+        <w:rPr>
+          <w:rStyle w:val="VerbatimChar"/>
+        </w:rPr>
         <w:t xml:space="preserve">RMSE</w:t>
       </w:r>
       <w:r>
-        <w:t xml:space="preserve"> </w:t>
-      </w:r>
-      <w:r>
-        <w:t xml:space="preserve">i siste kjøring, mens</w:t>
+        <w:t xml:space="preserve">, mens</w:t>
+      </w:r>
+      <w:r>
+        <w:t xml:space="preserve"> </w:t>
+      </w:r>
+      <w:r>
+        <w:rPr>
+          <w:rStyle w:val="VerbatimChar"/>
+        </w:rPr>
+        <w:t xml:space="preserve">eksponentiell glatting</w:t>
+      </w:r>
+      <w:r>
+        <w:t xml:space="preserve"> </w:t>
+      </w:r>
+      <w:r>
+        <w:t xml:space="preserve">er svakest på disse to målene.</w:t>
+      </w:r>
+      <w:r>
+        <w:t xml:space="preserve"> </w:t>
+      </w:r>
+      <w:r>
+        <w:rPr>
+          <w:rStyle w:val="VerbatimChar"/>
+        </w:rPr>
+        <w:t xml:space="preserve">MASE</w:t>
+      </w:r>
+      <w:r>
+        <w:t xml:space="preserve"> </w:t>
+      </w:r>
+      <w:r>
+        <w:t xml:space="preserve">nyanserer likevel rangeringen bak vinneren ved at</w:t>
+      </w:r>
+      <w:r>
+        <w:t xml:space="preserve"> </w:t>
+      </w:r>
+      <w:r>
+        <w:rPr>
+          <w:rStyle w:val="VerbatimChar"/>
+        </w:rPr>
+        <w:t xml:space="preserve">eksponentiell glatting</w:t>
+      </w:r>
+      <w:r>
+        <w:t xml:space="preserve"> </w:t>
+      </w:r>
+      <w:r>
+        <w:t xml:space="preserve">kommer bedre ut enn både</w:t>
       </w:r>
       <w:r>
         <w:t xml:space="preserve"> </w:t>
@@ -13113,7 +13619,7 @@
         <w:t xml:space="preserve"> </w:t>
       </w:r>
       <w:r>
-        <w:t xml:space="preserve">ligger svært nær hverandre. Eksponentiell glatting er svakest av de fire når alle sammenlignes på samme fartøynivå og samme evalueringslogikk.</w:t>
+        <w:t xml:space="preserve">når feilen skaleres mot en enkel naiv referanse.</w:t>
       </w:r>
     </w:p>
     <w:tbl>
@@ -13124,11 +13630,12 @@
         <w:tblLook w:firstRow="1" w:lastRow="0" w:firstColumn="0" w:lastColumn="0" w:noHBand="0" w:noVBand="0" w:val="0020"/>
       </w:tblPr>
       <w:tblGrid>
-        <w:gridCol w:w="1250"/>
-        <w:gridCol w:w="1667"/>
-        <w:gridCol w:w="1667"/>
-        <w:gridCol w:w="1667"/>
-        <w:gridCol w:w="1667"/>
+        <w:gridCol w:w="1033"/>
+        <w:gridCol w:w="1377"/>
+        <w:gridCol w:w="1377"/>
+        <w:gridCol w:w="1377"/>
+        <w:gridCol w:w="1377"/>
+        <w:gridCol w:w="1377"/>
       </w:tblGrid>
       <w:tr>
         <w:trPr>
@@ -13193,6 +13700,18 @@
             </w:r>
           </w:p>
         </w:tc>
+        <w:tc>
+          <w:tcPr/>
+          <w:p>
+            <w:pPr>
+              <w:pStyle w:val="Compact"/>
+              <w:jc w:val="right"/>
+            </w:pPr>
+            <w:r>
+              <w:t xml:space="preserve">MASE</w:t>
+            </w:r>
+          </w:p>
+        </w:tc>
       </w:tr>
       <w:tr>
         <w:tc>
@@ -13257,6 +13776,18 @@
             </w:r>
           </w:p>
         </w:tc>
+        <w:tc>
+          <w:tcPr/>
+          <w:p>
+            <w:pPr>
+              <w:pStyle w:val="Compact"/>
+              <w:jc w:val="right"/>
+            </w:pPr>
+            <w:r>
+              <w:t xml:space="preserve">0.91</w:t>
+            </w:r>
+          </w:p>
+        </w:tc>
       </w:tr>
       <w:tr>
         <w:tc>
@@ -13321,6 +13852,18 @@
             </w:r>
           </w:p>
         </w:tc>
+        <w:tc>
+          <w:tcPr/>
+          <w:p>
+            <w:pPr>
+              <w:pStyle w:val="Compact"/>
+              <w:jc w:val="right"/>
+            </w:pPr>
+            <w:r>
+              <w:t xml:space="preserve">1.20</w:t>
+            </w:r>
+          </w:p>
+        </w:tc>
       </w:tr>
       <w:tr>
         <w:tc>
@@ -13385,6 +13928,18 @@
             </w:r>
           </w:p>
         </w:tc>
+        <w:tc>
+          <w:tcPr/>
+          <w:p>
+            <w:pPr>
+              <w:pStyle w:val="Compact"/>
+              <w:jc w:val="right"/>
+            </w:pPr>
+            <w:r>
+              <w:t xml:space="preserve">1.32</w:t>
+            </w:r>
+          </w:p>
+        </w:tc>
       </w:tr>
       <w:tr>
         <w:tc>
@@ -13449,8 +14004,139 @@
             </w:r>
           </w:p>
         </w:tc>
+        <w:tc>
+          <w:tcPr/>
+          <w:p>
+            <w:pPr>
+              <w:pStyle w:val="Compact"/>
+              <w:jc w:val="right"/>
+            </w:pPr>
+            <w:r>
+              <w:t xml:space="preserve">1.18</w:t>
+            </w:r>
+          </w:p>
+        </w:tc>
       </w:tr>
     </w:tbl>
+    <w:p>
+      <w:pPr>
+        <w:pStyle w:val="BodyText"/>
+      </w:pPr>
+      <w:r>
+        <w:rPr>
+          <w:rStyle w:val="VerbatimChar"/>
+        </w:rPr>
+        <w:t xml:space="preserve">MASE</w:t>
+      </w:r>
+      <w:r>
+        <w:t xml:space="preserve"> </w:t>
+      </w:r>
+      <w:r>
+        <w:t xml:space="preserve">støtter dermed hovedfunnet om at</w:t>
+      </w:r>
+      <w:r>
+        <w:t xml:space="preserve"> </w:t>
+      </w:r>
+      <w:r>
+        <w:rPr>
+          <w:rStyle w:val="VerbatimChar"/>
+        </w:rPr>
+        <w:t xml:space="preserve">ARIMA/SARIMA</w:t>
+      </w:r>
+      <w:r>
+        <w:t xml:space="preserve"> </w:t>
+      </w:r>
+      <w:r>
+        <w:t xml:space="preserve">er den mest treffsikre modellen samlet sett, men viser også at bildet bak førsteplassen er mer sammensatt enn</w:t>
+      </w:r>
+      <w:r>
+        <w:t xml:space="preserve"> </w:t>
+      </w:r>
+      <w:r>
+        <w:rPr>
+          <w:rStyle w:val="VerbatimChar"/>
+        </w:rPr>
+        <w:t xml:space="preserve">MAE</w:t>
+      </w:r>
+      <w:r>
+        <w:t xml:space="preserve"> </w:t>
+      </w:r>
+      <w:r>
+        <w:t xml:space="preserve">alene antyder. En</w:t>
+      </w:r>
+      <w:r>
+        <w:t xml:space="preserve"> </w:t>
+      </w:r>
+      <w:r>
+        <w:rPr>
+          <w:rStyle w:val="VerbatimChar"/>
+        </w:rPr>
+        <w:t xml:space="preserve">MASE</w:t>
+      </w:r>
+      <w:r>
+        <w:t xml:space="preserve"> </w:t>
+      </w:r>
+      <w:r>
+        <w:t xml:space="preserve">under</w:t>
+      </w:r>
+      <w:r>
+        <w:t xml:space="preserve"> </w:t>
+      </w:r>
+      <w:r>
+        <w:rPr>
+          <w:rStyle w:val="VerbatimChar"/>
+        </w:rPr>
+        <w:t xml:space="preserve">1</w:t>
+      </w:r>
+      <w:r>
+        <w:t xml:space="preserve"> </w:t>
+      </w:r>
+      <w:r>
+        <w:t xml:space="preserve">for</w:t>
+      </w:r>
+      <w:r>
+        <w:t xml:space="preserve"> </w:t>
+      </w:r>
+      <w:r>
+        <w:rPr>
+          <w:rStyle w:val="VerbatimChar"/>
+        </w:rPr>
+        <w:t xml:space="preserve">ARIMA/SARIMA</w:t>
+      </w:r>
+      <w:r>
+        <w:t xml:space="preserve"> </w:t>
+      </w:r>
+      <w:r>
+        <w:t xml:space="preserve">betyr at modellen i gjennomsnitt slår den naive</w:t>
+      </w:r>
+      <w:r>
+        <w:t xml:space="preserve"> </w:t>
+      </w:r>
+      <w:r>
+        <w:rPr>
+          <w:rStyle w:val="VerbatimChar"/>
+        </w:rPr>
+        <w:t xml:space="preserve">lag-1</w:t>
+      </w:r>
+      <w:r>
+        <w:t xml:space="preserve">-referansen, mens de øvrige modellene ligger over</w:t>
+      </w:r>
+      <w:r>
+        <w:t xml:space="preserve"> </w:t>
+      </w:r>
+      <w:r>
+        <w:rPr>
+          <w:rStyle w:val="VerbatimChar"/>
+        </w:rPr>
+        <w:t xml:space="preserve">1</w:t>
+      </w:r>
+      <w:r>
+        <w:t xml:space="preserve"> </w:t>
+      </w:r>
+      <w:r>
+        <w:t xml:space="preserve">og dermed ikke forbedrer denne enkle baselinen like tydelig i testperioden.</w:t>
+      </w:r>
+    </w:p>
     <w:p>
       <w:pPr>
         <w:pStyle w:val="BodyText"/>
@@ -16697,6 +17383,18 @@
         <w:t xml:space="preserve">MAE</w:t>
       </w:r>
       <w:r>
+        <w:t xml:space="preserve">, lavest</w:t>
+      </w:r>
+      <w:r>
+        <w:t xml:space="preserve"> </w:t>
+      </w:r>
+      <w:r>
+        <w:rPr>
+          <w:rStyle w:val="VerbatimChar"/>
+        </w:rPr>
+        <w:t xml:space="preserve">RMSE</w:t>
+      </w:r>
+      <w:r>
         <w:t xml:space="preserve"> </w:t>
       </w:r>
       <w:r>
@@ -16709,7 +17407,7 @@
         <w:rPr>
           <w:rStyle w:val="VerbatimChar"/>
         </w:rPr>
-        <w:t xml:space="preserve">RMSE</w:t>
+        <w:t xml:space="preserve">MASE</w:t>
       </w:r>
       <w:r>
         <w:t xml:space="preserve"> </w:t>
@@ -16745,7 +17443,49 @@
         <w:t xml:space="preserve"> </w:t>
       </w:r>
       <w:r>
-        <w:t xml:space="preserve">presterte konkurransedyktig uten å overgå den beste klassiske modellen. Eksponentiell glatting fungerte som en stabil og transparent benchmark, men kom svakere ut enn de tre øvrige modellene. Samlet tyder dette på at datastrukturen i denne studien fortsatt belønner modeller som kan utnytte fartøyspesifikk tidsseriedynamikk på en presis og parsimonisk måte.</w:t>
+        <w:t xml:space="preserve">presterte konkurransedyktig uten å overgå den beste klassiske modellen. Eksponentiell glatting fungerte som en stabil og transparent benchmark. Selv om den kom svakere ut på absolutte feil, viser</w:t>
+      </w:r>
+      <w:r>
+        <w:t xml:space="preserve"> </w:t>
+      </w:r>
+      <w:r>
+        <w:rPr>
+          <w:rStyle w:val="VerbatimChar"/>
+        </w:rPr>
+        <w:t xml:space="preserve">MASE</w:t>
+      </w:r>
+      <w:r>
+        <w:t xml:space="preserve"> </w:t>
+      </w:r>
+      <w:r>
+        <w:t xml:space="preserve">at den likevel forbedrer den naive referansen noe bedre enn både</w:t>
+      </w:r>
+      <w:r>
+        <w:t xml:space="preserve"> </w:t>
+      </w:r>
+      <w:r>
+        <w:rPr>
+          <w:rStyle w:val="VerbatimChar"/>
+        </w:rPr>
+        <w:t xml:space="preserve">XGBoost</w:t>
+      </w:r>
+      <w:r>
+        <w:t xml:space="preserve"> </w:t>
+      </w:r>
+      <w:r>
+        <w:t xml:space="preserve">og</w:t>
+      </w:r>
+      <w:r>
+        <w:t xml:space="preserve"> </w:t>
+      </w:r>
+      <w:r>
+        <w:rPr>
+          <w:rStyle w:val="VerbatimChar"/>
+        </w:rPr>
+        <w:t xml:space="preserve">LSTM</w:t>
+      </w:r>
+      <w:r>
+        <w:t xml:space="preserve">. Samlet tyder dette på at datastrukturen i denne studien fortsatt belønner modeller som kan utnytte fartøyspesifikk tidsseriedynamikk på en presis og parsimonisk måte.</w:t>
       </w:r>
     </w:p>
     <w:p>
@@ -17246,7 +17986,7 @@
         <w:t xml:space="preserve"> </w:t>
       </w:r>
       <w:r>
-        <w:t xml:space="preserve">best i den historiske testen, målt ved både</w:t>
+        <w:t xml:space="preserve">best i den historiske testen, målt ved</w:t>
       </w:r>
       <w:r>
         <w:t xml:space="preserve"> </w:t>
@@ -17258,6 +17998,18 @@
         <w:t xml:space="preserve">MAE</w:t>
       </w:r>
       <w:r>
+        <w:t xml:space="preserve">,</w:t>
+      </w:r>
+      <w:r>
+        <w:t xml:space="preserve"> </w:t>
+      </w:r>
+      <w:r>
+        <w:rPr>
+          <w:rStyle w:val="VerbatimChar"/>
+        </w:rPr>
+        <w:t xml:space="preserve">RMSE</w:t>
+      </w:r>
+      <w:r>
         <w:t xml:space="preserve"> </w:t>
       </w:r>
       <w:r>
@@ -17270,7 +18022,7 @@
         <w:rPr>
           <w:rStyle w:val="VerbatimChar"/>
         </w:rPr>
-        <w:t xml:space="preserve">RMSE</w:t>
+        <w:t xml:space="preserve">MASE</w:t>
       </w:r>
       <w:r>
         <w:t xml:space="preserve">.</w:t>
@@ -17303,7 +18055,7 @@
         <w:t xml:space="preserve"> </w:t>
       </w:r>
       <w:r>
-        <w:t xml:space="preserve">var konkurransedyktige, men ga ikke tydelig bedre resultater enn den beste klassiske modellen, mens</w:t>
+        <w:t xml:space="preserve">var konkurransedyktige på absolutt feil, men ga ikke tydelig bedre resultater enn den beste klassiske modellen, mens</w:t>
       </w:r>
       <w:r>
         <w:t xml:space="preserve"> </w:t>
@@ -17318,7 +18070,19 @@
         <w:t xml:space="preserve"> </w:t>
       </w:r>
       <w:r>
-        <w:t xml:space="preserve">fungerte som en nyttig, men svakere benchmark. Problemstillingen kan dermed besvares med at valg av modell har betydning, og at klassiske tidsseriemodeller i dette datasettet ga høyest prediksjonsnøyaktighet.</w:t>
+        <w:t xml:space="preserve">fungerte som en nyttig benchmark og kom noe bedre ut enn disse to på</w:t>
+      </w:r>
+      <w:r>
+        <w:t xml:space="preserve"> </w:t>
+      </w:r>
+      <w:r>
+        <w:rPr>
+          <w:rStyle w:val="VerbatimChar"/>
+        </w:rPr>
+        <w:t xml:space="preserve">MASE</w:t>
+      </w:r>
+      <w:r>
+        <w:t xml:space="preserve">. Problemstillingen kan dermed besvares med at valg av modell har betydning, og at klassiske tidsseriemodeller i dette datasettet ga høyest prediksjonsnøyaktighet.</w:t>
       </w:r>
     </w:p>
     <w:p>
@@ -19381,10 +20145,7 @@
               <w:t xml:space="preserve">RMSE</w:t>
             </w:r>
             <w:r>
-              <w:t xml:space="preserve"> </w:t>
-            </w:r>
-            <w:r>
-              <w:t xml:space="preserve">og</w:t>
+              <w:t xml:space="preserve">,</w:t>
             </w:r>
             <w:r>
               <w:t xml:space="preserve"> </w:t>
@@ -19394,6 +20155,21 @@
                 <w:rStyle w:val="VerbatimChar"/>
               </w:rPr>
               <w:t xml:space="preserve">sMAPE</w:t>
+            </w:r>
+            <w:r>
+              <w:t xml:space="preserve"> </w:t>
+            </w:r>
+            <w:r>
+              <w:t xml:space="preserve">og</w:t>
+            </w:r>
+            <w:r>
+              <w:t xml:space="preserve"> </w:t>
+            </w:r>
+            <w:r>
+              <w:rPr>
+                <w:rStyle w:val="VerbatimChar"/>
+              </w:rPr>
+              <w:t xml:space="preserve">MASE</w:t>
             </w:r>
             <w:r>
               <w:t xml:space="preserve"> </w:t>

</xml_diff>